<commit_message>
Revise setup guide - fix flow and remove redundant steps
</commit_message>
<xml_diff>
--- a/getting-started-vscode-windows.docx
+++ b/getting-started-vscode-windows.docx
@@ -759,25 +759,7 @@
           <w:sz w:val="20"/>
           <w:szCs w:val="20"/>
         </w:rPr>
-        <w:t xml:space="preserve">. VSCode will open.</w:t>
-      </w:r>
-    </w:p>
-    <w:p>
-      <w:pPr>
-        <w:pStyle w:val="ListParagraph"/>
-        <w:numPr>
-          <w:ilvl w:val="0"/>
-          <w:numId w:val="2"/>
-        </w:numPr>
-        <w:spacing w:after="40" w:before="40"/>
-      </w:pPr>
-      <w:r>
-        <w:rPr>
-          <w:rFonts w:ascii="Calibri" w:cs="Calibri" w:eastAsia="Calibri" w:hAnsi="Calibri"/>
-          <w:sz w:val="20"/>
-          <w:szCs w:val="20"/>
-        </w:rPr>
-        <w:t xml:space="preserve">You can close VSCode for now - you will come back to it shortly.</w:t>
+        <w:t xml:space="preserve">. VSCode will open - continue straight to Part 2.</w:t>
       </w:r>
     </w:p>
     <w:p>
@@ -833,24 +815,6 @@
           <w:sz w:val="20"/>
           <w:szCs w:val="20"/>
         </w:rPr>
-        <w:t xml:space="preserve">Open VSCode.</w:t>
-      </w:r>
-    </w:p>
-    <w:p>
-      <w:pPr>
-        <w:pStyle w:val="ListParagraph"/>
-        <w:numPr>
-          <w:ilvl w:val="0"/>
-          <w:numId w:val="2"/>
-        </w:numPr>
-        <w:spacing w:after="40" w:before="40"/>
-      </w:pPr>
-      <w:r>
-        <w:rPr>
-          <w:rFonts w:ascii="Calibri" w:cs="Calibri" w:eastAsia="Calibri" w:hAnsi="Calibri"/>
-          <w:sz w:val="20"/>
-          <w:szCs w:val="20"/>
-        </w:rPr>
         <w:t xml:space="preserve">Click the </w:t>
       </w:r>
       <w:r>
@@ -869,7 +833,7 @@
           <w:sz w:val="20"/>
           <w:szCs w:val="20"/>
         </w:rPr>
-        <w:t xml:space="preserve"> at the very bottom-left of the window (it looks like a silhouette).</w:t>
+        <w:t xml:space="preserve"> at the very bottom-left of the VSCode window (it looks like a silhouette).</w:t>
       </w:r>
     </w:p>
     <w:p>
@@ -905,7 +869,7 @@
           <w:sz w:val="20"/>
           <w:szCs w:val="20"/>
         </w:rPr>
-        <w:t xml:space="preserve"> then </w:t>
+        <w:t xml:space="preserve">, then </w:t>
       </w:r>
       <w:r>
         <w:rPr>
@@ -1243,7 +1207,7 @@
           <w:sz w:val="20"/>
           <w:szCs w:val="20"/>
         </w:rPr>
-        <w:t xml:space="preserve"> (press Windows key, type </w:t>
+        <w:t xml:space="preserve"> (Windows key, type </w:t>
       </w:r>
       <w:r>
         <w:rPr>
@@ -1686,7 +1650,7 @@
           <w:sz w:val="20"/>
           <w:szCs w:val="20"/>
         </w:rPr>
-        <w:t xml:space="preserve">Close any open Command Prompt windows and reopen a fresh one.</w:t>
+        <w:t xml:space="preserve">Close any open Command Prompt windows and reopen a fresh one before continuing.</w:t>
       </w:r>
     </w:p>
     <w:p>
@@ -3350,7 +3314,7 @@
           <w:sz w:val="20"/>
           <w:szCs w:val="20"/>
         </w:rPr>
-        <w:t xml:space="preserve">Extensions add extra features to VSCode. You need three of them.</w:t>
+        <w:t xml:space="preserve">Extensions add extra features to VSCode. You need two extensions now, and one more after you clone the repository in Part 6.</w:t>
       </w:r>
     </w:p>
     <w:p>
@@ -3398,7 +3362,7 @@
           <w:sz w:val="20"/>
           <w:szCs w:val="20"/>
         </w:rPr>
-        <w:t xml:space="preserve">Open VSCode (make sure you are in your </w:t>
+        <w:t xml:space="preserve">Make sure you are in your </w:t>
       </w:r>
       <w:r>
         <w:rPr>
@@ -3416,7 +3380,7 @@
           <w:sz w:val="20"/>
           <w:szCs w:val="20"/>
         </w:rPr>
-        <w:t xml:space="preserve"> profile).</w:t>
+        <w:t xml:space="preserve"> profile.</w:t>
       </w:r>
     </w:p>
     <w:p>
@@ -3677,49 +3641,6 @@
           <w:szCs w:val="20"/>
         </w:rPr>
         <w:t xml:space="preserve">.</w:t>
-      </w:r>
-    </w:p>
-    <w:p>
-      <w:pPr>
-        <w:pStyle w:val="Heading3"/>
-        <w:spacing w:after="60" w:before="200"/>
-      </w:pPr>
-      <w:r>
-        <w:rPr>
-          <w:rFonts w:ascii="Calibri" w:cs="Calibri" w:eastAsia="Calibri" w:hAnsi="Calibri"/>
-          <w:b/>
-          <w:bCs/>
-          <w:color w:val="2E75B6"/>
-          <w:sz w:val="22"/>
-          <w:szCs w:val="22"/>
-        </w:rPr>
-        <w:t xml:space="preserve">Install the Cisco U Preview extension</w:t>
-      </w:r>
-    </w:p>
-    <w:p>
-      <w:pPr>
-        <w:spacing w:after="60" w:before="60"/>
-      </w:pPr>
-      <w:r>
-        <w:rPr>
-          <w:rFonts w:ascii="Calibri" w:cs="Calibri" w:eastAsia="Calibri" w:hAnsi="Calibri"/>
-          <w:sz w:val="20"/>
-          <w:szCs w:val="20"/>
-        </w:rPr>
-        <w:t xml:space="preserve">This shows you how your content will look inside the Cisco U learning platform while you are writing it.</w:t>
-      </w:r>
-    </w:p>
-    <w:p>
-      <w:pPr>
-        <w:spacing w:after="60" w:before="60"/>
-      </w:pPr>
-      <w:r>
-        <w:rPr>
-          <w:rFonts w:ascii="Calibri" w:cs="Calibri" w:eastAsia="Calibri" w:hAnsi="Calibri"/>
-          <w:sz w:val="20"/>
-          <w:szCs w:val="20"/>
-        </w:rPr>
-        <w:t xml:space="preserve">The extension file is stored in the Skyline DevTeam-Sandbox repository. You will install it after cloning the repo in Part 6.</w:t>
       </w:r>
     </w:p>
     <w:p>
@@ -3744,7 +3665,7 @@
           <w:sz w:val="28"/>
           <w:szCs w:val="28"/>
         </w:rPr>
-        <w:t xml:space="preserve">Part 6 - Clone the Skyline DevTeam Sandbox repository</w:t>
+        <w:t xml:space="preserve">Part 6 - Clone the Skyline DevTeam Sandbox and finish setup</w:t>
       </w:r>
     </w:p>
     <w:p>
@@ -3780,38 +3701,19 @@
     </w:p>
     <w:p>
       <w:pPr>
-        <w:pStyle w:val="ListParagraph"/>
-        <w:numPr>
-          <w:ilvl w:val="0"/>
-          <w:numId w:val="2"/>
-        </w:numPr>
-        <w:spacing w:after="40" w:before="40"/>
-      </w:pPr>
-      <w:r>
-        <w:rPr>
-          <w:rFonts w:ascii="Calibri" w:cs="Calibri" w:eastAsia="Calibri" w:hAnsi="Calibri"/>
-          <w:sz w:val="20"/>
-          <w:szCs w:val="20"/>
-        </w:rPr>
-        <w:t xml:space="preserve">Open VSCode (in your </w:t>
-      </w:r>
-      <w:r>
-        <w:rPr>
-          <w:rFonts w:ascii="Calibri" w:cs="Calibri" w:eastAsia="Calibri" w:hAnsi="Calibri"/>
-          <w:b/>
-          <w:bCs/>
-          <w:sz w:val="20"/>
-          <w:szCs w:val="20"/>
-        </w:rPr>
-        <w:t xml:space="preserve">Skyline / Cisco</w:t>
-      </w:r>
-      <w:r>
-        <w:rPr>
-          <w:rFonts w:ascii="Calibri" w:cs="Calibri" w:eastAsia="Calibri" w:hAnsi="Calibri"/>
-          <w:sz w:val="20"/>
-          <w:szCs w:val="20"/>
-        </w:rPr>
-        <w:t xml:space="preserve"> profile).</w:t>
+        <w:pStyle w:val="Heading3"/>
+        <w:spacing w:after="60" w:before="200"/>
+      </w:pPr>
+      <w:r>
+        <w:rPr>
+          <w:rFonts w:ascii="Calibri" w:cs="Calibri" w:eastAsia="Calibri" w:hAnsi="Calibri"/>
+          <w:b/>
+          <w:bCs/>
+          <w:color w:val="2E75B6"/>
+          <w:sz w:val="22"/>
+          <w:szCs w:val="22"/>
+        </w:rPr>
+        <w:t xml:space="preserve">Clone the repository</w:t>
       </w:r>
     </w:p>
     <w:p>
@@ -3915,7 +3817,7 @@
           <w:sz w:val="20"/>
           <w:szCs w:val="20"/>
         </w:rPr>
-        <w:t xml:space="preserve">When the input box appears, paste the following URL and press </w:t>
+        <w:t xml:space="preserve">A box appears at the top of the screen. It may show a dropdown list of repositories - ignore the list and type or paste the following URL directly into the box, then press </w:t>
       </w:r>
       <w:r>
         <w:rPr>
@@ -4071,7 +3973,20 @@
           <w:sz w:val="22"/>
           <w:szCs w:val="22"/>
         </w:rPr>
-        <w:t xml:space="preserve">Install the Cisco U Preview extension from the repo</w:t>
+        <w:t xml:space="preserve">Install the Cisco U Preview extension</w:t>
+      </w:r>
+    </w:p>
+    <w:p>
+      <w:pPr>
+        <w:spacing w:after="60" w:before="60"/>
+      </w:pPr>
+      <w:r>
+        <w:rPr>
+          <w:rFonts w:ascii="Calibri" w:cs="Calibri" w:eastAsia="Calibri" w:hAnsi="Calibri"/>
+          <w:sz w:val="20"/>
+          <w:szCs w:val="20"/>
+        </w:rPr>
+        <w:t xml:space="preserve">This shows you how your content will look inside the Cisco U learning platform while you are writing it. The extension file is included in the repository you just cloned.</w:t>
       </w:r>
     </w:p>
     <w:p>
@@ -4157,7 +4072,7 @@
           <w:sz w:val="20"/>
           <w:szCs w:val="20"/>
         </w:rPr>
-        <w:t xml:space="preserve">Navigate to the </w:t>
+        <w:t xml:space="preserve">In the file picker, navigate to the </w:t>
       </w:r>
       <w:r>
         <w:rPr>
@@ -4284,7 +4199,7 @@
           <w:sz w:val="28"/>
           <w:szCs w:val="28"/>
         </w:rPr>
-        <w:t xml:space="preserve">Part 7 - Your first practice: Clone, edit, commit, push</w:t>
+        <w:t xml:space="preserve">Part 7 - Your first practice: edit, commit, push</w:t>
       </w:r>
     </w:p>
     <w:p>
@@ -4299,6 +4214,184 @@
         </w:rPr>
         <w:t xml:space="preserve">Now you will make a real change to the DevTeam-Sandbox. This is your practice run of the full authoring workflow.</w:t>
       </w:r>
+    </w:p>
+    <w:p>
+      <w:pPr>
+        <w:pStyle w:val="Heading3"/>
+        <w:spacing w:after="60" w:before="200"/>
+      </w:pPr>
+      <w:r>
+        <w:rPr>
+          <w:rFonts w:ascii="Calibri" w:cs="Calibri" w:eastAsia="Calibri" w:hAnsi="Calibri"/>
+          <w:b/>
+          <w:bCs/>
+          <w:color w:val="2E75B6"/>
+          <w:sz w:val="22"/>
+          <w:szCs w:val="22"/>
+        </w:rPr>
+        <w:t xml:space="preserve">Before you start - pull the latest changes</w:t>
+      </w:r>
+    </w:p>
+    <w:p>
+      <w:pPr>
+        <w:spacing w:after="60" w:before="60"/>
+      </w:pPr>
+      <w:r>
+        <w:rPr>
+          <w:rFonts w:ascii="Calibri" w:cs="Calibri" w:eastAsia="Calibri" w:hAnsi="Calibri"/>
+          <w:sz w:val="20"/>
+          <w:szCs w:val="20"/>
+        </w:rPr>
+        <w:t xml:space="preserve">Before doing any work, always pull first to make sure your local copy is up to date with whatever anyone else may have added.</w:t>
+      </w:r>
+    </w:p>
+    <w:p>
+      <w:pPr>
+        <w:pStyle w:val="ListParagraph"/>
+        <w:numPr>
+          <w:ilvl w:val="0"/>
+          <w:numId w:val="2"/>
+        </w:numPr>
+        <w:spacing w:after="40" w:before="40"/>
+      </w:pPr>
+      <w:r>
+        <w:rPr>
+          <w:rFonts w:ascii="Calibri" w:cs="Calibri" w:eastAsia="Calibri" w:hAnsi="Calibri"/>
+          <w:sz w:val="20"/>
+          <w:szCs w:val="20"/>
+        </w:rPr>
+        <w:t xml:space="preserve">Click the </w:t>
+      </w:r>
+      <w:r>
+        <w:rPr>
+          <w:rFonts w:ascii="Calibri" w:cs="Calibri" w:eastAsia="Calibri" w:hAnsi="Calibri"/>
+          <w:b/>
+          <w:bCs/>
+          <w:sz w:val="20"/>
+          <w:szCs w:val="20"/>
+        </w:rPr>
+        <w:t xml:space="preserve">Source Control</w:t>
+      </w:r>
+      <w:r>
+        <w:rPr>
+          <w:rFonts w:ascii="Calibri" w:cs="Calibri" w:eastAsia="Calibri" w:hAnsi="Calibri"/>
+          <w:sz w:val="20"/>
+          <w:szCs w:val="20"/>
+        </w:rPr>
+        <w:t xml:space="preserve"> icon in the left sidebar (it looks like a branching tree - third icon down).</w:t>
+      </w:r>
+    </w:p>
+    <w:p>
+      <w:pPr>
+        <w:pStyle w:val="ListParagraph"/>
+        <w:numPr>
+          <w:ilvl w:val="0"/>
+          <w:numId w:val="2"/>
+        </w:numPr>
+        <w:spacing w:after="40" w:before="40"/>
+      </w:pPr>
+      <w:r>
+        <w:rPr>
+          <w:rFonts w:ascii="Calibri" w:cs="Calibri" w:eastAsia="Calibri" w:hAnsi="Calibri"/>
+          <w:sz w:val="20"/>
+          <w:szCs w:val="20"/>
+        </w:rPr>
+        <w:t xml:space="preserve">Click the </w:t>
+      </w:r>
+      <w:r>
+        <w:rPr>
+          <w:rFonts w:ascii="Calibri" w:cs="Calibri" w:eastAsia="Calibri" w:hAnsi="Calibri"/>
+          <w:b/>
+          <w:bCs/>
+          <w:sz w:val="20"/>
+          <w:szCs w:val="20"/>
+        </w:rPr>
+        <w:t xml:space="preserve">...</w:t>
+      </w:r>
+      <w:r>
+        <w:rPr>
+          <w:rFonts w:ascii="Calibri" w:cs="Calibri" w:eastAsia="Calibri" w:hAnsi="Calibri"/>
+          <w:sz w:val="20"/>
+          <w:szCs w:val="20"/>
+        </w:rPr>
+        <w:t xml:space="preserve"> (three dots) menu at the top of the Source Control panel.</w:t>
+      </w:r>
+    </w:p>
+    <w:p>
+      <w:pPr>
+        <w:pStyle w:val="ListParagraph"/>
+        <w:numPr>
+          <w:ilvl w:val="0"/>
+          <w:numId w:val="2"/>
+        </w:numPr>
+        <w:spacing w:after="40" w:before="40"/>
+      </w:pPr>
+      <w:r>
+        <w:rPr>
+          <w:rFonts w:ascii="Calibri" w:cs="Calibri" w:eastAsia="Calibri" w:hAnsi="Calibri"/>
+          <w:sz w:val="20"/>
+          <w:szCs w:val="20"/>
+        </w:rPr>
+        <w:t xml:space="preserve">Select </w:t>
+      </w:r>
+      <w:r>
+        <w:rPr>
+          <w:rFonts w:ascii="Calibri" w:cs="Calibri" w:eastAsia="Calibri" w:hAnsi="Calibri"/>
+          <w:b/>
+          <w:bCs/>
+          <w:sz w:val="20"/>
+          <w:szCs w:val="20"/>
+        </w:rPr>
+        <w:t xml:space="preserve">Pull</w:t>
+      </w:r>
+      <w:r>
+        <w:rPr>
+          <w:rFonts w:ascii="Calibri" w:cs="Calibri" w:eastAsia="Calibri" w:hAnsi="Calibri"/>
+          <w:sz w:val="20"/>
+          <w:szCs w:val="20"/>
+        </w:rPr>
+        <w:t xml:space="preserve">.</w:t>
+      </w:r>
+    </w:p>
+    <w:p>
+      <w:pPr>
+        <w:spacing w:after="100" w:before="0"/>
+      </w:pPr>
+    </w:p>
+    <w:p>
+      <w:pPr>
+        <w:pBdr>
+          <w:left w:val="single" w:color="70AD47" w:sz="12"/>
+        </w:pBdr>
+        <w:shd w:fill="E2EFDA" w:val="clear"/>
+        <w:spacing w:after="100" w:before="100"/>
+        <w:ind w:left="200"/>
+      </w:pPr>
+      <w:r>
+        <w:rPr>
+          <w:rFonts w:ascii="Calibri" w:cs="Calibri" w:eastAsia="Calibri" w:hAnsi="Calibri"/>
+          <w:b/>
+          <w:bCs/>
+          <w:color w:val="1F5C1F"/>
+          <w:sz w:val="20"/>
+          <w:szCs w:val="20"/>
+        </w:rPr>
+        <w:t xml:space="preserve">Tip: </w:t>
+      </w:r>
+      <w:r>
+        <w:rPr>
+          <w:rFonts w:ascii="Calibri" w:cs="Calibri" w:eastAsia="Calibri" w:hAnsi="Calibri"/>
+          <w:color w:val="1F5C1F"/>
+          <w:sz w:val="20"/>
+          <w:szCs w:val="20"/>
+        </w:rPr>
+        <w:t xml:space="preserve">If you just cloned the repo a moment ago you can skip this - you already have the latest. But pulling first will become a habit that saves you headaches when working with others.</w:t>
+      </w:r>
+    </w:p>
+    <w:p>
+      <w:pPr>
+        <w:spacing w:after="100" w:before="0"/>
+      </w:pPr>
     </w:p>
     <w:p>
       <w:pPr>
@@ -4344,7 +4437,7 @@
           <w:sz w:val="20"/>
           <w:szCs w:val="20"/>
         </w:rPr>
-        <w:t xml:space="preserve">Never edit directly on the main branch. Always create your own branch first.</w:t>
+        <w:t xml:space="preserve">Never edit directly on the main branch. Always create your own branch first. A branch is your own private workspace - nothing you do there affects the main content until you choose to merge it.</w:t>
       </w:r>
     </w:p>
     <w:p>
@@ -4528,15 +4621,73 @@
     </w:p>
     <w:p>
       <w:pPr>
-        <w:spacing w:after="60" w:before="60"/>
-      </w:pPr>
-      <w:r>
-        <w:rPr>
-          <w:rFonts w:ascii="Calibri" w:cs="Calibri" w:eastAsia="Calibri" w:hAnsi="Calibri"/>
-          <w:sz w:val="20"/>
-          <w:szCs w:val="20"/>
-        </w:rPr>
-        <w:t xml:space="preserve">You are now working in your own isolated copy. Nothing you do here affects the </w:t>
+        <w:pStyle w:val="Heading3"/>
+        <w:spacing w:after="60" w:before="200"/>
+      </w:pPr>
+      <w:r>
+        <w:rPr>
+          <w:rFonts w:ascii="Calibri" w:cs="Calibri" w:eastAsia="Calibri" w:hAnsi="Calibri"/>
+          <w:b/>
+          <w:bCs/>
+          <w:color w:val="2E75B6"/>
+          <w:sz w:val="22"/>
+          <w:szCs w:val="22"/>
+        </w:rPr>
+        <w:t xml:space="preserve">Step 2 - Create a practice file</w:t>
+      </w:r>
+    </w:p>
+    <w:p>
+      <w:pPr>
+        <w:pStyle w:val="ListParagraph"/>
+        <w:numPr>
+          <w:ilvl w:val="0"/>
+          <w:numId w:val="2"/>
+        </w:numPr>
+        <w:spacing w:after="40" w:before="40"/>
+      </w:pPr>
+      <w:r>
+        <w:rPr>
+          <w:rFonts w:ascii="Calibri" w:cs="Calibri" w:eastAsia="Calibri" w:hAnsi="Calibri"/>
+          <w:sz w:val="20"/>
+          <w:szCs w:val="20"/>
+        </w:rPr>
+        <w:t xml:space="preserve">In the Explorer panel (left sidebar, top icon), right-click in an empty area and select </w:t>
+      </w:r>
+      <w:r>
+        <w:rPr>
+          <w:rFonts w:ascii="Calibri" w:cs="Calibri" w:eastAsia="Calibri" w:hAnsi="Calibri"/>
+          <w:b/>
+          <w:bCs/>
+          <w:sz w:val="20"/>
+          <w:szCs w:val="20"/>
+        </w:rPr>
+        <w:t xml:space="preserve">New File</w:t>
+      </w:r>
+      <w:r>
+        <w:rPr>
+          <w:rFonts w:ascii="Calibri" w:cs="Calibri" w:eastAsia="Calibri" w:hAnsi="Calibri"/>
+          <w:sz w:val="20"/>
+          <w:szCs w:val="20"/>
+        </w:rPr>
+        <w:t xml:space="preserve">.</w:t>
+      </w:r>
+    </w:p>
+    <w:p>
+      <w:pPr>
+        <w:pStyle w:val="ListParagraph"/>
+        <w:numPr>
+          <w:ilvl w:val="0"/>
+          <w:numId w:val="2"/>
+        </w:numPr>
+        <w:spacing w:after="40" w:before="40"/>
+      </w:pPr>
+      <w:r>
+        <w:rPr>
+          <w:rFonts w:ascii="Calibri" w:cs="Calibri" w:eastAsia="Calibri" w:hAnsi="Calibri"/>
+          <w:sz w:val="20"/>
+          <w:szCs w:val="20"/>
+        </w:rPr>
+        <w:t xml:space="preserve">Name it </w:t>
       </w:r>
       <w:r>
         <w:rPr>
@@ -4544,15 +4695,83 @@
           <w:sz w:val="18"/>
           <w:szCs w:val="18"/>
         </w:rPr>
-        <w:t xml:space="preserve">main</w:t>
-      </w:r>
-      <w:r>
-        <w:rPr>
-          <w:rFonts w:ascii="Calibri" w:cs="Calibri" w:eastAsia="Calibri" w:hAnsi="Calibri"/>
-          <w:sz w:val="20"/>
-          <w:szCs w:val="20"/>
-        </w:rPr>
-        <w:t xml:space="preserve"> branch until you choose to merge it.</w:t>
+        <w:t xml:space="preserve">practice-YOUR-NAME.md</w:t>
+      </w:r>
+      <w:r>
+        <w:rPr>
+          <w:rFonts w:ascii="Calibri" w:cs="Calibri" w:eastAsia="Calibri" w:hAnsi="Calibri"/>
+          <w:sz w:val="20"/>
+          <w:szCs w:val="20"/>
+        </w:rPr>
+        <w:t xml:space="preserve"> (e.g. </w:t>
+      </w:r>
+      <w:r>
+        <w:rPr>
+          <w:rFonts w:ascii="Courier New" w:cs="Courier New" w:eastAsia="Courier New" w:hAnsi="Courier New"/>
+          <w:sz w:val="18"/>
+          <w:szCs w:val="18"/>
+        </w:rPr>
+        <w:t xml:space="preserve">practice-jsmith.md</w:t>
+      </w:r>
+      <w:r>
+        <w:rPr>
+          <w:rFonts w:ascii="Calibri" w:cs="Calibri" w:eastAsia="Calibri" w:hAnsi="Calibri"/>
+          <w:sz w:val="20"/>
+          <w:szCs w:val="20"/>
+        </w:rPr>
+        <w:t xml:space="preserve">).</w:t>
+      </w:r>
+    </w:p>
+    <w:p>
+      <w:pPr>
+        <w:pStyle w:val="ListParagraph"/>
+        <w:numPr>
+          <w:ilvl w:val="0"/>
+          <w:numId w:val="2"/>
+        </w:numPr>
+        <w:spacing w:after="40" w:before="40"/>
+      </w:pPr>
+      <w:r>
+        <w:rPr>
+          <w:rFonts w:ascii="Calibri" w:cs="Calibri" w:eastAsia="Calibri" w:hAnsi="Calibri"/>
+          <w:sz w:val="20"/>
+          <w:szCs w:val="20"/>
+        </w:rPr>
+        <w:t xml:space="preserve">Click on the file to open it and type a few lines - anything you like.</w:t>
+      </w:r>
+    </w:p>
+    <w:p>
+      <w:pPr>
+        <w:pStyle w:val="ListParagraph"/>
+        <w:numPr>
+          <w:ilvl w:val="0"/>
+          <w:numId w:val="2"/>
+        </w:numPr>
+        <w:spacing w:after="40" w:before="40"/>
+      </w:pPr>
+      <w:r>
+        <w:rPr>
+          <w:rFonts w:ascii="Calibri" w:cs="Calibri" w:eastAsia="Calibri" w:hAnsi="Calibri"/>
+          <w:sz w:val="20"/>
+          <w:szCs w:val="20"/>
+        </w:rPr>
+        <w:t xml:space="preserve">Save the file with </w:t>
+      </w:r>
+      <w:r>
+        <w:rPr>
+          <w:rFonts w:ascii="Courier New" w:cs="Courier New" w:eastAsia="Courier New" w:hAnsi="Courier New"/>
+          <w:sz w:val="18"/>
+          <w:szCs w:val="18"/>
+        </w:rPr>
+        <w:t xml:space="preserve">Ctrl+S</w:t>
+      </w:r>
+      <w:r>
+        <w:rPr>
+          <w:rFonts w:ascii="Calibri" w:cs="Calibri" w:eastAsia="Calibri" w:hAnsi="Calibri"/>
+          <w:sz w:val="20"/>
+          <w:szCs w:val="20"/>
+        </w:rPr>
+        <w:t xml:space="preserve">.</w:t>
       </w:r>
     </w:p>
     <w:p>
@@ -4569,61 +4788,25 @@
           <w:sz w:val="22"/>
           <w:szCs w:val="22"/>
         </w:rPr>
-        <w:t xml:space="preserve">Step 2 - Create a practice file</w:t>
-      </w:r>
-    </w:p>
-    <w:p>
-      <w:pPr>
-        <w:pStyle w:val="ListParagraph"/>
-        <w:numPr>
-          <w:ilvl w:val="0"/>
-          <w:numId w:val="2"/>
-        </w:numPr>
-        <w:spacing w:after="40" w:before="40"/>
-      </w:pPr>
-      <w:r>
-        <w:rPr>
-          <w:rFonts w:ascii="Calibri" w:cs="Calibri" w:eastAsia="Calibri" w:hAnsi="Calibri"/>
-          <w:sz w:val="20"/>
-          <w:szCs w:val="20"/>
-        </w:rPr>
-        <w:t xml:space="preserve">In the Explorer panel, right-click in an empty area and select </w:t>
-      </w:r>
-      <w:r>
-        <w:rPr>
-          <w:rFonts w:ascii="Calibri" w:cs="Calibri" w:eastAsia="Calibri" w:hAnsi="Calibri"/>
-          <w:b/>
-          <w:bCs/>
-          <w:sz w:val="20"/>
-          <w:szCs w:val="20"/>
-        </w:rPr>
-        <w:t xml:space="preserve">New File</w:t>
-      </w:r>
-      <w:r>
-        <w:rPr>
-          <w:rFonts w:ascii="Calibri" w:cs="Calibri" w:eastAsia="Calibri" w:hAnsi="Calibri"/>
-          <w:sz w:val="20"/>
-          <w:szCs w:val="20"/>
-        </w:rPr>
-        <w:t xml:space="preserve">.</w:t>
-      </w:r>
-    </w:p>
-    <w:p>
-      <w:pPr>
-        <w:pStyle w:val="ListParagraph"/>
-        <w:numPr>
-          <w:ilvl w:val="0"/>
-          <w:numId w:val="2"/>
-        </w:numPr>
-        <w:spacing w:after="40" w:before="40"/>
-      </w:pPr>
-      <w:r>
-        <w:rPr>
-          <w:rFonts w:ascii="Calibri" w:cs="Calibri" w:eastAsia="Calibri" w:hAnsi="Calibri"/>
-          <w:sz w:val="20"/>
-          <w:szCs w:val="20"/>
-        </w:rPr>
-        <w:t xml:space="preserve">Name it </w:t>
+        <w:t xml:space="preserve">Step 3 - Preview your Markdown (optional)</w:t>
+      </w:r>
+    </w:p>
+    <w:p>
+      <w:pPr>
+        <w:pStyle w:val="ListParagraph"/>
+        <w:numPr>
+          <w:ilvl w:val="0"/>
+          <w:numId w:val="2"/>
+        </w:numPr>
+        <w:spacing w:after="40" w:before="40"/>
+      </w:pPr>
+      <w:r>
+        <w:rPr>
+          <w:rFonts w:ascii="Calibri" w:cs="Calibri" w:eastAsia="Calibri" w:hAnsi="Calibri"/>
+          <w:sz w:val="20"/>
+          <w:szCs w:val="20"/>
+        </w:rPr>
+        <w:t xml:space="preserve">With your </w:t>
       </w:r>
       <w:r>
         <w:rPr>
@@ -4631,15 +4814,15 @@
           <w:sz w:val="18"/>
           <w:szCs w:val="18"/>
         </w:rPr>
-        <w:t xml:space="preserve">practice-YOUR-NAME.md</w:t>
-      </w:r>
-      <w:r>
-        <w:rPr>
-          <w:rFonts w:ascii="Calibri" w:cs="Calibri" w:eastAsia="Calibri" w:hAnsi="Calibri"/>
-          <w:sz w:val="20"/>
-          <w:szCs w:val="20"/>
-        </w:rPr>
-        <w:t xml:space="preserve"> (e.g. </w:t>
+        <w:t xml:space="preserve">.md</w:t>
+      </w:r>
+      <w:r>
+        <w:rPr>
+          <w:rFonts w:ascii="Calibri" w:cs="Calibri" w:eastAsia="Calibri" w:hAnsi="Calibri"/>
+          <w:sz w:val="20"/>
+          <w:szCs w:val="20"/>
+        </w:rPr>
+        <w:t xml:space="preserve"> file open, press </w:t>
       </w:r>
       <w:r>
         <w:rPr>
@@ -4647,51 +4830,33 @@
           <w:sz w:val="18"/>
           <w:szCs w:val="18"/>
         </w:rPr>
-        <w:t xml:space="preserve">practice-jsmith.md</w:t>
-      </w:r>
-      <w:r>
-        <w:rPr>
-          <w:rFonts w:ascii="Calibri" w:cs="Calibri" w:eastAsia="Calibri" w:hAnsi="Calibri"/>
-          <w:sz w:val="20"/>
-          <w:szCs w:val="20"/>
-        </w:rPr>
-        <w:t xml:space="preserve">).</w:t>
-      </w:r>
-    </w:p>
-    <w:p>
-      <w:pPr>
-        <w:pStyle w:val="ListParagraph"/>
-        <w:numPr>
-          <w:ilvl w:val="0"/>
-          <w:numId w:val="2"/>
-        </w:numPr>
-        <w:spacing w:after="40" w:before="40"/>
-      </w:pPr>
-      <w:r>
-        <w:rPr>
-          <w:rFonts w:ascii="Calibri" w:cs="Calibri" w:eastAsia="Calibri" w:hAnsi="Calibri"/>
-          <w:sz w:val="20"/>
-          <w:szCs w:val="20"/>
-        </w:rPr>
-        <w:t xml:space="preserve">Click on the file to open it and type a few lines - anything you like.</w:t>
-      </w:r>
-    </w:p>
-    <w:p>
-      <w:pPr>
-        <w:pStyle w:val="ListParagraph"/>
-        <w:numPr>
-          <w:ilvl w:val="0"/>
-          <w:numId w:val="2"/>
-        </w:numPr>
-        <w:spacing w:after="40" w:before="40"/>
-      </w:pPr>
-      <w:r>
-        <w:rPr>
-          <w:rFonts w:ascii="Calibri" w:cs="Calibri" w:eastAsia="Calibri" w:hAnsi="Calibri"/>
-          <w:sz w:val="20"/>
-          <w:szCs w:val="20"/>
-        </w:rPr>
-        <w:t xml:space="preserve">Save the file with </w:t>
+        <w:t xml:space="preserve">Ctrl+Shift+P</w:t>
+      </w:r>
+      <w:r>
+        <w:rPr>
+          <w:rFonts w:ascii="Calibri" w:cs="Calibri" w:eastAsia="Calibri" w:hAnsi="Calibri"/>
+          <w:sz w:val="20"/>
+          <w:szCs w:val="20"/>
+        </w:rPr>
+        <w:t xml:space="preserve">.</w:t>
+      </w:r>
+    </w:p>
+    <w:p>
+      <w:pPr>
+        <w:pStyle w:val="ListParagraph"/>
+        <w:numPr>
+          <w:ilvl w:val="0"/>
+          <w:numId w:val="2"/>
+        </w:numPr>
+        <w:spacing w:after="40" w:before="40"/>
+      </w:pPr>
+      <w:r>
+        <w:rPr>
+          <w:rFonts w:ascii="Calibri" w:cs="Calibri" w:eastAsia="Calibri" w:hAnsi="Calibri"/>
+          <w:sz w:val="20"/>
+          <w:szCs w:val="20"/>
+        </w:rPr>
+        <w:t xml:space="preserve">Type </w:t>
       </w:r>
       <w:r>
         <w:rPr>
@@ -4699,15 +4864,33 @@
           <w:sz w:val="18"/>
           <w:szCs w:val="18"/>
         </w:rPr>
-        <w:t xml:space="preserve">Ctrl+S</w:t>
-      </w:r>
-      <w:r>
-        <w:rPr>
-          <w:rFonts w:ascii="Calibri" w:cs="Calibri" w:eastAsia="Calibri" w:hAnsi="Calibri"/>
-          <w:sz w:val="20"/>
-          <w:szCs w:val="20"/>
-        </w:rPr>
-        <w:t xml:space="preserve">.</w:t>
+        <w:t xml:space="preserve">Markdown: Open Preview to the Side</w:t>
+      </w:r>
+      <w:r>
+        <w:rPr>
+          <w:rFonts w:ascii="Calibri" w:cs="Calibri" w:eastAsia="Calibri" w:hAnsi="Calibri"/>
+          <w:sz w:val="20"/>
+          <w:szCs w:val="20"/>
+        </w:rPr>
+        <w:t xml:space="preserve"> and select it.</w:t>
+      </w:r>
+    </w:p>
+    <w:p>
+      <w:pPr>
+        <w:pStyle w:val="ListParagraph"/>
+        <w:numPr>
+          <w:ilvl w:val="0"/>
+          <w:numId w:val="2"/>
+        </w:numPr>
+        <w:spacing w:after="40" w:before="40"/>
+      </w:pPr>
+      <w:r>
+        <w:rPr>
+          <w:rFonts w:ascii="Calibri" w:cs="Calibri" w:eastAsia="Calibri" w:hAnsi="Calibri"/>
+          <w:sz w:val="20"/>
+          <w:szCs w:val="20"/>
+        </w:rPr>
+        <w:t xml:space="preserve">A preview panel opens to the right showing your formatted content.</w:t>
       </w:r>
     </w:p>
     <w:p>
@@ -4724,25 +4907,164 @@
           <w:sz w:val="22"/>
           <w:szCs w:val="22"/>
         </w:rPr>
-        <w:t xml:space="preserve">Step 3 - Preview your Markdown (optional)</w:t>
-      </w:r>
-    </w:p>
-    <w:p>
-      <w:pPr>
-        <w:pStyle w:val="ListParagraph"/>
-        <w:numPr>
-          <w:ilvl w:val="0"/>
-          <w:numId w:val="2"/>
-        </w:numPr>
-        <w:spacing w:after="40" w:before="40"/>
-      </w:pPr>
-      <w:r>
-        <w:rPr>
-          <w:rFonts w:ascii="Calibri" w:cs="Calibri" w:eastAsia="Calibri" w:hAnsi="Calibri"/>
-          <w:sz w:val="20"/>
-          <w:szCs w:val="20"/>
-        </w:rPr>
-        <w:t xml:space="preserve">With your </w:t>
+        <w:t xml:space="preserve">Step 4 - Stage and commit your changes</w:t>
+      </w:r>
+    </w:p>
+    <w:p>
+      <w:pPr>
+        <w:spacing w:after="60" w:before="60"/>
+      </w:pPr>
+      <w:r>
+        <w:rPr>
+          <w:rFonts w:ascii="Calibri" w:cs="Calibri" w:eastAsia="Calibri" w:hAnsi="Calibri"/>
+          <w:sz w:val="20"/>
+          <w:szCs w:val="20"/>
+        </w:rPr>
+        <w:t xml:space="preserve">Committing saves a snapshot of your changes locally - think of it like hitting Save in Xyleme, except it also records what changed and why.</w:t>
+      </w:r>
+    </w:p>
+    <w:p>
+      <w:pPr>
+        <w:pStyle w:val="ListParagraph"/>
+        <w:numPr>
+          <w:ilvl w:val="0"/>
+          <w:numId w:val="2"/>
+        </w:numPr>
+        <w:spacing w:after="40" w:before="40"/>
+      </w:pPr>
+      <w:r>
+        <w:rPr>
+          <w:rFonts w:ascii="Calibri" w:cs="Calibri" w:eastAsia="Calibri" w:hAnsi="Calibri"/>
+          <w:sz w:val="20"/>
+          <w:szCs w:val="20"/>
+        </w:rPr>
+        <w:t xml:space="preserve">Click the </w:t>
+      </w:r>
+      <w:r>
+        <w:rPr>
+          <w:rFonts w:ascii="Calibri" w:cs="Calibri" w:eastAsia="Calibri" w:hAnsi="Calibri"/>
+          <w:b/>
+          <w:bCs/>
+          <w:sz w:val="20"/>
+          <w:szCs w:val="20"/>
+        </w:rPr>
+        <w:t xml:space="preserve">Source Control</w:t>
+      </w:r>
+      <w:r>
+        <w:rPr>
+          <w:rFonts w:ascii="Calibri" w:cs="Calibri" w:eastAsia="Calibri" w:hAnsi="Calibri"/>
+          <w:sz w:val="20"/>
+          <w:szCs w:val="20"/>
+        </w:rPr>
+        <w:t xml:space="preserve"> icon in the left sidebar.</w:t>
+      </w:r>
+    </w:p>
+    <w:p>
+      <w:pPr>
+        <w:pStyle w:val="ListParagraph"/>
+        <w:numPr>
+          <w:ilvl w:val="0"/>
+          <w:numId w:val="2"/>
+        </w:numPr>
+        <w:spacing w:after="40" w:before="40"/>
+      </w:pPr>
+      <w:r>
+        <w:rPr>
+          <w:rFonts w:ascii="Calibri" w:cs="Calibri" w:eastAsia="Calibri" w:hAnsi="Calibri"/>
+          <w:sz w:val="20"/>
+          <w:szCs w:val="20"/>
+        </w:rPr>
+        <w:t xml:space="preserve">Under </w:t>
+      </w:r>
+      <w:r>
+        <w:rPr>
+          <w:rFonts w:ascii="Calibri" w:cs="Calibri" w:eastAsia="Calibri" w:hAnsi="Calibri"/>
+          <w:b/>
+          <w:bCs/>
+          <w:sz w:val="20"/>
+          <w:szCs w:val="20"/>
+        </w:rPr>
+        <w:t xml:space="preserve">Changes</w:t>
+      </w:r>
+      <w:r>
+        <w:rPr>
+          <w:rFonts w:ascii="Calibri" w:cs="Calibri" w:eastAsia="Calibri" w:hAnsi="Calibri"/>
+          <w:sz w:val="20"/>
+          <w:szCs w:val="20"/>
+        </w:rPr>
+        <w:t xml:space="preserve">, you will see your new file listed.</w:t>
+      </w:r>
+    </w:p>
+    <w:p>
+      <w:pPr>
+        <w:pStyle w:val="ListParagraph"/>
+        <w:numPr>
+          <w:ilvl w:val="0"/>
+          <w:numId w:val="2"/>
+        </w:numPr>
+        <w:spacing w:after="40" w:before="40"/>
+      </w:pPr>
+      <w:r>
+        <w:rPr>
+          <w:rFonts w:ascii="Calibri" w:cs="Calibri" w:eastAsia="Calibri" w:hAnsi="Calibri"/>
+          <w:sz w:val="20"/>
+          <w:szCs w:val="20"/>
+        </w:rPr>
+        <w:t xml:space="preserve">Hover over your file and click the </w:t>
+      </w:r>
+      <w:r>
+        <w:rPr>
+          <w:rFonts w:ascii="Calibri" w:cs="Calibri" w:eastAsia="Calibri" w:hAnsi="Calibri"/>
+          <w:b/>
+          <w:bCs/>
+          <w:sz w:val="20"/>
+          <w:szCs w:val="20"/>
+        </w:rPr>
+        <w:t xml:space="preserve">+</w:t>
+      </w:r>
+      <w:r>
+        <w:rPr>
+          <w:rFonts w:ascii="Calibri" w:cs="Calibri" w:eastAsia="Calibri" w:hAnsi="Calibri"/>
+          <w:sz w:val="20"/>
+          <w:szCs w:val="20"/>
+        </w:rPr>
+        <w:t xml:space="preserve"> icon that appears - this stages the file (marks it ready to commit).</w:t>
+      </w:r>
+    </w:p>
+    <w:p>
+      <w:pPr>
+        <w:pStyle w:val="ListParagraph"/>
+        <w:numPr>
+          <w:ilvl w:val="0"/>
+          <w:numId w:val="2"/>
+        </w:numPr>
+        <w:spacing w:after="40" w:before="40"/>
+      </w:pPr>
+      <w:r>
+        <w:rPr>
+          <w:rFonts w:ascii="Calibri" w:cs="Calibri" w:eastAsia="Calibri" w:hAnsi="Calibri"/>
+          <w:sz w:val="20"/>
+          <w:szCs w:val="20"/>
+        </w:rPr>
+        <w:t xml:space="preserve">In the text box at the top that says </w:t>
+      </w:r>
+      <w:r>
+        <w:rPr>
+          <w:rFonts w:ascii="Calibri" w:cs="Calibri" w:eastAsia="Calibri" w:hAnsi="Calibri"/>
+          <w:b/>
+          <w:bCs/>
+          <w:sz w:val="20"/>
+          <w:szCs w:val="20"/>
+        </w:rPr>
+        <w:t xml:space="preserve">Message</w:t>
+      </w:r>
+      <w:r>
+        <w:rPr>
+          <w:rFonts w:ascii="Calibri" w:cs="Calibri" w:eastAsia="Calibri" w:hAnsi="Calibri"/>
+          <w:sz w:val="20"/>
+          <w:szCs w:val="20"/>
+        </w:rPr>
+        <w:t xml:space="preserve">, type a short description of what you did. For example: </w:t>
       </w:r>
       <w:r>
         <w:rPr>
@@ -4750,15 +5072,255 @@
           <w:sz w:val="18"/>
           <w:szCs w:val="18"/>
         </w:rPr>
-        <w:t xml:space="preserve">.md</w:t>
-      </w:r>
-      <w:r>
-        <w:rPr>
-          <w:rFonts w:ascii="Calibri" w:cs="Calibri" w:eastAsia="Calibri" w:hAnsi="Calibri"/>
-          <w:sz w:val="20"/>
-          <w:szCs w:val="20"/>
-        </w:rPr>
-        <w:t xml:space="preserve"> file open, press </w:t>
+        <w:t xml:space="preserve">Add practice file for jsmith</w:t>
+      </w:r>
+      <w:r>
+        <w:rPr>
+          <w:rFonts w:ascii="Calibri" w:cs="Calibri" w:eastAsia="Calibri" w:hAnsi="Calibri"/>
+          <w:sz w:val="20"/>
+          <w:szCs w:val="20"/>
+        </w:rPr>
+        <w:t xml:space="preserve">.</w:t>
+      </w:r>
+    </w:p>
+    <w:p>
+      <w:pPr>
+        <w:pStyle w:val="ListParagraph"/>
+        <w:numPr>
+          <w:ilvl w:val="0"/>
+          <w:numId w:val="2"/>
+        </w:numPr>
+        <w:spacing w:after="40" w:before="40"/>
+      </w:pPr>
+      <w:r>
+        <w:rPr>
+          <w:rFonts w:ascii="Calibri" w:cs="Calibri" w:eastAsia="Calibri" w:hAnsi="Calibri"/>
+          <w:sz w:val="20"/>
+          <w:szCs w:val="20"/>
+        </w:rPr>
+        <w:t xml:space="preserve">Click the </w:t>
+      </w:r>
+      <w:r>
+        <w:rPr>
+          <w:rFonts w:ascii="Calibri" w:cs="Calibri" w:eastAsia="Calibri" w:hAnsi="Calibri"/>
+          <w:b/>
+          <w:bCs/>
+          <w:sz w:val="20"/>
+          <w:szCs w:val="20"/>
+        </w:rPr>
+        <w:t xml:space="preserve">Commit</w:t>
+      </w:r>
+      <w:r>
+        <w:rPr>
+          <w:rFonts w:ascii="Calibri" w:cs="Calibri" w:eastAsia="Calibri" w:hAnsi="Calibri"/>
+          <w:sz w:val="20"/>
+          <w:szCs w:val="20"/>
+        </w:rPr>
+        <w:t xml:space="preserve"> button (the checkmark above the message box).</w:t>
+      </w:r>
+    </w:p>
+    <w:p>
+      <w:pPr>
+        <w:spacing w:after="60" w:before="60"/>
+      </w:pPr>
+      <w:r>
+        <w:rPr>
+          <w:rFonts w:ascii="Calibri" w:cs="Calibri" w:eastAsia="Calibri" w:hAnsi="Calibri"/>
+          <w:sz w:val="20"/>
+          <w:szCs w:val="20"/>
+        </w:rPr>
+        <w:t xml:space="preserve">Your change is now saved locally.</w:t>
+      </w:r>
+    </w:p>
+    <w:p>
+      <w:pPr>
+        <w:pStyle w:val="Heading3"/>
+        <w:spacing w:after="60" w:before="200"/>
+      </w:pPr>
+      <w:r>
+        <w:rPr>
+          <w:rFonts w:ascii="Calibri" w:cs="Calibri" w:eastAsia="Calibri" w:hAnsi="Calibri"/>
+          <w:b/>
+          <w:bCs/>
+          <w:color w:val="2E75B6"/>
+          <w:sz w:val="22"/>
+          <w:szCs w:val="22"/>
+        </w:rPr>
+        <w:t xml:space="preserve">Step 5 - Push your changes to GitHub</w:t>
+      </w:r>
+    </w:p>
+    <w:p>
+      <w:pPr>
+        <w:spacing w:after="60" w:before="60"/>
+      </w:pPr>
+      <w:r>
+        <w:rPr>
+          <w:rFonts w:ascii="Calibri" w:cs="Calibri" w:eastAsia="Calibri" w:hAnsi="Calibri"/>
+          <w:sz w:val="20"/>
+          <w:szCs w:val="20"/>
+        </w:rPr>
+        <w:t xml:space="preserve">Pushing uploads your local commits to GitHub so the team can see them.</w:t>
+      </w:r>
+    </w:p>
+    <w:p>
+      <w:pPr>
+        <w:pStyle w:val="ListParagraph"/>
+        <w:numPr>
+          <w:ilvl w:val="0"/>
+          <w:numId w:val="2"/>
+        </w:numPr>
+        <w:spacing w:after="40" w:before="40"/>
+      </w:pPr>
+      <w:r>
+        <w:rPr>
+          <w:rFonts w:ascii="Calibri" w:cs="Calibri" w:eastAsia="Calibri" w:hAnsi="Calibri"/>
+          <w:sz w:val="20"/>
+          <w:szCs w:val="20"/>
+        </w:rPr>
+        <w:t xml:space="preserve">After committing, you will see a </w:t>
+      </w:r>
+      <w:r>
+        <w:rPr>
+          <w:rFonts w:ascii="Calibri" w:cs="Calibri" w:eastAsia="Calibri" w:hAnsi="Calibri"/>
+          <w:b/>
+          <w:bCs/>
+          <w:sz w:val="20"/>
+          <w:szCs w:val="20"/>
+        </w:rPr>
+        <w:t xml:space="preserve">Publish Branch</w:t>
+      </w:r>
+      <w:r>
+        <w:rPr>
+          <w:rFonts w:ascii="Calibri" w:cs="Calibri" w:eastAsia="Calibri" w:hAnsi="Calibri"/>
+          <w:sz w:val="20"/>
+          <w:szCs w:val="20"/>
+        </w:rPr>
+        <w:t xml:space="preserve"> or </w:t>
+      </w:r>
+      <w:r>
+        <w:rPr>
+          <w:rFonts w:ascii="Calibri" w:cs="Calibri" w:eastAsia="Calibri" w:hAnsi="Calibri"/>
+          <w:b/>
+          <w:bCs/>
+          <w:sz w:val="20"/>
+          <w:szCs w:val="20"/>
+        </w:rPr>
+        <w:t xml:space="preserve">Sync Changes</w:t>
+      </w:r>
+      <w:r>
+        <w:rPr>
+          <w:rFonts w:ascii="Calibri" w:cs="Calibri" w:eastAsia="Calibri" w:hAnsi="Calibri"/>
+          <w:sz w:val="20"/>
+          <w:szCs w:val="20"/>
+        </w:rPr>
+        <w:t xml:space="preserve"> button in the Source Control panel. Click it.</w:t>
+      </w:r>
+    </w:p>
+    <w:p>
+      <w:pPr>
+        <w:pStyle w:val="ListParagraph"/>
+        <w:numPr>
+          <w:ilvl w:val="0"/>
+          <w:numId w:val="2"/>
+        </w:numPr>
+        <w:spacing w:after="40" w:before="40"/>
+      </w:pPr>
+      <w:r>
+        <w:rPr>
+          <w:rFonts w:ascii="Calibri" w:cs="Calibri" w:eastAsia="Calibri" w:hAnsi="Calibri"/>
+          <w:sz w:val="20"/>
+          <w:szCs w:val="20"/>
+        </w:rPr>
+        <w:t xml:space="preserve">VSCode may open a browser window asking you to sign in to GitHub - go ahead and sign in with your GitHub account. This only happens the first time.</w:t>
+      </w:r>
+    </w:p>
+    <w:p>
+      <w:pPr>
+        <w:pStyle w:val="ListParagraph"/>
+        <w:numPr>
+          <w:ilvl w:val="0"/>
+          <w:numId w:val="2"/>
+        </w:numPr>
+        <w:spacing w:after="40" w:before="40"/>
+      </w:pPr>
+      <w:r>
+        <w:rPr>
+          <w:rFonts w:ascii="Calibri" w:cs="Calibri" w:eastAsia="Calibri" w:hAnsi="Calibri"/>
+          <w:sz w:val="20"/>
+          <w:szCs w:val="20"/>
+        </w:rPr>
+        <w:t xml:space="preserve">If asked whether to publish to GitHub, click </w:t>
+      </w:r>
+      <w:r>
+        <w:rPr>
+          <w:rFonts w:ascii="Calibri" w:cs="Calibri" w:eastAsia="Calibri" w:hAnsi="Calibri"/>
+          <w:b/>
+          <w:bCs/>
+          <w:sz w:val="20"/>
+          <w:szCs w:val="20"/>
+        </w:rPr>
+        <w:t xml:space="preserve">OK</w:t>
+      </w:r>
+      <w:r>
+        <w:rPr>
+          <w:rFonts w:ascii="Calibri" w:cs="Calibri" w:eastAsia="Calibri" w:hAnsi="Calibri"/>
+          <w:sz w:val="20"/>
+          <w:szCs w:val="20"/>
+        </w:rPr>
+        <w:t xml:space="preserve"> or </w:t>
+      </w:r>
+      <w:r>
+        <w:rPr>
+          <w:rFonts w:ascii="Calibri" w:cs="Calibri" w:eastAsia="Calibri" w:hAnsi="Calibri"/>
+          <w:b/>
+          <w:bCs/>
+          <w:sz w:val="20"/>
+          <w:szCs w:val="20"/>
+        </w:rPr>
+        <w:t xml:space="preserve">Publish Branch</w:t>
+      </w:r>
+      <w:r>
+        <w:rPr>
+          <w:rFonts w:ascii="Calibri" w:cs="Calibri" w:eastAsia="Calibri" w:hAnsi="Calibri"/>
+          <w:sz w:val="20"/>
+          <w:szCs w:val="20"/>
+        </w:rPr>
+        <w:t xml:space="preserve">.</w:t>
+      </w:r>
+    </w:p>
+    <w:p>
+      <w:pPr>
+        <w:pStyle w:val="Heading3"/>
+        <w:spacing w:after="60" w:before="200"/>
+      </w:pPr>
+      <w:r>
+        <w:rPr>
+          <w:rFonts w:ascii="Calibri" w:cs="Calibri" w:eastAsia="Calibri" w:hAnsi="Calibri"/>
+          <w:b/>
+          <w:bCs/>
+          <w:color w:val="2E75B6"/>
+          <w:sz w:val="22"/>
+          <w:szCs w:val="22"/>
+        </w:rPr>
+        <w:t xml:space="preserve">Step 6 - Verify on GitHub</w:t>
+      </w:r>
+    </w:p>
+    <w:p>
+      <w:pPr>
+        <w:pStyle w:val="ListParagraph"/>
+        <w:numPr>
+          <w:ilvl w:val="0"/>
+          <w:numId w:val="2"/>
+        </w:numPr>
+        <w:spacing w:after="40" w:before="40"/>
+      </w:pPr>
+      <w:r>
+        <w:rPr>
+          <w:rFonts w:ascii="Calibri" w:cs="Calibri" w:eastAsia="Calibri" w:hAnsi="Calibri"/>
+          <w:sz w:val="20"/>
+          <w:szCs w:val="20"/>
+        </w:rPr>
+        <w:t xml:space="preserve">Open your web browser and go to </w:t>
       </w:r>
       <w:r>
         <w:rPr>
@@ -4766,7 +5328,7 @@
           <w:sz w:val="18"/>
           <w:szCs w:val="18"/>
         </w:rPr>
-        <w:t xml:space="preserve">Ctrl+Shift+P</w:t>
+        <w:t xml:space="preserve">https://github.com/skyline-ats/DevTeam-Sandbox</w:t>
       </w:r>
       <w:r>
         <w:rPr>
@@ -4792,7 +5354,25 @@
           <w:sz w:val="20"/>
           <w:szCs w:val="20"/>
         </w:rPr>
-        <w:t xml:space="preserve">Type </w:t>
+        <w:t xml:space="preserve">Click the </w:t>
+      </w:r>
+      <w:r>
+        <w:rPr>
+          <w:rFonts w:ascii="Calibri" w:cs="Calibri" w:eastAsia="Calibri" w:hAnsi="Calibri"/>
+          <w:b/>
+          <w:bCs/>
+          <w:sz w:val="20"/>
+          <w:szCs w:val="20"/>
+        </w:rPr>
+        <w:t xml:space="preserve">branch dropdown</w:t>
+      </w:r>
+      <w:r>
+        <w:rPr>
+          <w:rFonts w:ascii="Calibri" w:cs="Calibri" w:eastAsia="Calibri" w:hAnsi="Calibri"/>
+          <w:sz w:val="20"/>
+          <w:szCs w:val="20"/>
+        </w:rPr>
+        <w:t xml:space="preserve"> (it says </w:t>
       </w:r>
       <w:r>
         <w:rPr>
@@ -4800,51 +5380,39 @@
           <w:sz w:val="18"/>
           <w:szCs w:val="18"/>
         </w:rPr>
-        <w:t xml:space="preserve">Markdown: Open Preview to the Side</w:t>
-      </w:r>
-      <w:r>
-        <w:rPr>
-          <w:rFonts w:ascii="Calibri" w:cs="Calibri" w:eastAsia="Calibri" w:hAnsi="Calibri"/>
-          <w:sz w:val="20"/>
-          <w:szCs w:val="20"/>
-        </w:rPr>
-        <w:t xml:space="preserve"> and select it.</w:t>
-      </w:r>
-    </w:p>
-    <w:p>
-      <w:pPr>
-        <w:pStyle w:val="ListParagraph"/>
-        <w:numPr>
-          <w:ilvl w:val="0"/>
-          <w:numId w:val="2"/>
-        </w:numPr>
-        <w:spacing w:after="40" w:before="40"/>
-      </w:pPr>
-      <w:r>
-        <w:rPr>
-          <w:rFonts w:ascii="Calibri" w:cs="Calibri" w:eastAsia="Calibri" w:hAnsi="Calibri"/>
-          <w:sz w:val="20"/>
-          <w:szCs w:val="20"/>
-        </w:rPr>
-        <w:t xml:space="preserve">A preview panel opens to the right showing your formatted content.</w:t>
-      </w:r>
-    </w:p>
-    <w:p>
-      <w:pPr>
-        <w:pStyle w:val="Heading3"/>
-        <w:spacing w:after="60" w:before="200"/>
-      </w:pPr>
-      <w:r>
-        <w:rPr>
-          <w:rFonts w:ascii="Calibri" w:cs="Calibri" w:eastAsia="Calibri" w:hAnsi="Calibri"/>
-          <w:b/>
-          <w:bCs/>
-          <w:color w:val="2E75B6"/>
-          <w:sz w:val="22"/>
-          <w:szCs w:val="22"/>
-        </w:rPr>
-        <w:t xml:space="preserve">Step 4 - Stage and commit your changes</w:t>
-      </w:r>
+        <w:t xml:space="preserve">main</w:t>
+      </w:r>
+      <w:r>
+        <w:rPr>
+          <w:rFonts w:ascii="Calibri" w:cs="Calibri" w:eastAsia="Calibri" w:hAnsi="Calibri"/>
+          <w:sz w:val="20"/>
+          <w:szCs w:val="20"/>
+        </w:rPr>
+        <w:t xml:space="preserve"> by default) and look for your branch name.</w:t>
+      </w:r>
+    </w:p>
+    <w:p>
+      <w:pPr>
+        <w:pStyle w:val="ListParagraph"/>
+        <w:numPr>
+          <w:ilvl w:val="0"/>
+          <w:numId w:val="2"/>
+        </w:numPr>
+        <w:spacing w:after="40" w:before="40"/>
+      </w:pPr>
+      <w:r>
+        <w:rPr>
+          <w:rFonts w:ascii="Calibri" w:cs="Calibri" w:eastAsia="Calibri" w:hAnsi="Calibri"/>
+          <w:sz w:val="20"/>
+          <w:szCs w:val="20"/>
+        </w:rPr>
+        <w:t xml:space="preserve">Select your branch - you should see your practice file there.</w:t>
+      </w:r>
+    </w:p>
+    <w:p>
+      <w:pPr>
+        <w:spacing w:after="100" w:before="0"/>
+      </w:pPr>
     </w:p>
     <w:p>
       <w:pPr>
@@ -4853,493 +5421,12 @@
       <w:r>
         <w:rPr>
           <w:rFonts w:ascii="Calibri" w:cs="Calibri" w:eastAsia="Calibri" w:hAnsi="Calibri"/>
-          <w:sz w:val="20"/>
-          <w:szCs w:val="20"/>
-        </w:rPr>
-        <w:t xml:space="preserve">Committing saves a snapshot of your changes locally.</w:t>
-      </w:r>
-    </w:p>
-    <w:p>
-      <w:pPr>
-        <w:pStyle w:val="ListParagraph"/>
-        <w:numPr>
-          <w:ilvl w:val="0"/>
-          <w:numId w:val="2"/>
-        </w:numPr>
-        <w:spacing w:after="40" w:before="40"/>
-      </w:pPr>
-      <w:r>
-        <w:rPr>
-          <w:rFonts w:ascii="Calibri" w:cs="Calibri" w:eastAsia="Calibri" w:hAnsi="Calibri"/>
-          <w:sz w:val="20"/>
-          <w:szCs w:val="20"/>
-        </w:rPr>
-        <w:t xml:space="preserve">Click the </w:t>
-      </w:r>
-      <w:r>
-        <w:rPr>
-          <w:rFonts w:ascii="Calibri" w:cs="Calibri" w:eastAsia="Calibri" w:hAnsi="Calibri"/>
-          <w:b/>
-          <w:bCs/>
-          <w:sz w:val="20"/>
-          <w:szCs w:val="20"/>
-        </w:rPr>
-        <w:t xml:space="preserve">Source Control</w:t>
-      </w:r>
-      <w:r>
-        <w:rPr>
-          <w:rFonts w:ascii="Calibri" w:cs="Calibri" w:eastAsia="Calibri" w:hAnsi="Calibri"/>
-          <w:sz w:val="20"/>
-          <w:szCs w:val="20"/>
-        </w:rPr>
-        <w:t xml:space="preserve"> icon in the left sidebar (it looks like a branching tree - third icon down).</w:t>
-      </w:r>
-    </w:p>
-    <w:p>
-      <w:pPr>
-        <w:pStyle w:val="ListParagraph"/>
-        <w:numPr>
-          <w:ilvl w:val="0"/>
-          <w:numId w:val="2"/>
-        </w:numPr>
-        <w:spacing w:after="40" w:before="40"/>
-      </w:pPr>
-      <w:r>
-        <w:rPr>
-          <w:rFonts w:ascii="Calibri" w:cs="Calibri" w:eastAsia="Calibri" w:hAnsi="Calibri"/>
-          <w:sz w:val="20"/>
-          <w:szCs w:val="20"/>
-        </w:rPr>
-        <w:t xml:space="preserve">Under </w:t>
-      </w:r>
-      <w:r>
-        <w:rPr>
-          <w:rFonts w:ascii="Calibri" w:cs="Calibri" w:eastAsia="Calibri" w:hAnsi="Calibri"/>
-          <w:b/>
-          <w:bCs/>
-          <w:sz w:val="20"/>
-          <w:szCs w:val="20"/>
-        </w:rPr>
-        <w:t xml:space="preserve">Changes</w:t>
-      </w:r>
-      <w:r>
-        <w:rPr>
-          <w:rFonts w:ascii="Calibri" w:cs="Calibri" w:eastAsia="Calibri" w:hAnsi="Calibri"/>
-          <w:sz w:val="20"/>
-          <w:szCs w:val="20"/>
-        </w:rPr>
-        <w:t xml:space="preserve">, you will see your new file listed.</w:t>
-      </w:r>
-    </w:p>
-    <w:p>
-      <w:pPr>
-        <w:pStyle w:val="ListParagraph"/>
-        <w:numPr>
-          <w:ilvl w:val="0"/>
-          <w:numId w:val="2"/>
-        </w:numPr>
-        <w:spacing w:after="40" w:before="40"/>
-      </w:pPr>
-      <w:r>
-        <w:rPr>
-          <w:rFonts w:ascii="Calibri" w:cs="Calibri" w:eastAsia="Calibri" w:hAnsi="Calibri"/>
-          <w:sz w:val="20"/>
-          <w:szCs w:val="20"/>
-        </w:rPr>
-        <w:t xml:space="preserve">Hover over your file and click the </w:t>
-      </w:r>
-      <w:r>
-        <w:rPr>
-          <w:rFonts w:ascii="Calibri" w:cs="Calibri" w:eastAsia="Calibri" w:hAnsi="Calibri"/>
-          <w:b/>
-          <w:bCs/>
-          <w:sz w:val="20"/>
-          <w:szCs w:val="20"/>
-        </w:rPr>
-        <w:t xml:space="preserve">+</w:t>
-      </w:r>
-      <w:r>
-        <w:rPr>
-          <w:rFonts w:ascii="Calibri" w:cs="Calibri" w:eastAsia="Calibri" w:hAnsi="Calibri"/>
-          <w:sz w:val="20"/>
-          <w:szCs w:val="20"/>
-        </w:rPr>
-        <w:t xml:space="preserve"> icon that appears - this stages the file (marks it ready to commit).</w:t>
-      </w:r>
-    </w:p>
-    <w:p>
-      <w:pPr>
-        <w:pStyle w:val="ListParagraph"/>
-        <w:numPr>
-          <w:ilvl w:val="0"/>
-          <w:numId w:val="2"/>
-        </w:numPr>
-        <w:spacing w:after="40" w:before="40"/>
-      </w:pPr>
-      <w:r>
-        <w:rPr>
-          <w:rFonts w:ascii="Calibri" w:cs="Calibri" w:eastAsia="Calibri" w:hAnsi="Calibri"/>
-          <w:sz w:val="20"/>
-          <w:szCs w:val="20"/>
-        </w:rPr>
-        <w:t xml:space="preserve">In the text box at the top that says </w:t>
-      </w:r>
-      <w:r>
-        <w:rPr>
-          <w:rFonts w:ascii="Calibri" w:cs="Calibri" w:eastAsia="Calibri" w:hAnsi="Calibri"/>
-          <w:b/>
-          <w:bCs/>
-          <w:sz w:val="20"/>
-          <w:szCs w:val="20"/>
-        </w:rPr>
-        <w:t xml:space="preserve">Message</w:t>
-      </w:r>
-      <w:r>
-        <w:rPr>
-          <w:rFonts w:ascii="Calibri" w:cs="Calibri" w:eastAsia="Calibri" w:hAnsi="Calibri"/>
-          <w:sz w:val="20"/>
-          <w:szCs w:val="20"/>
-        </w:rPr>
-        <w:t xml:space="preserve">, type a short description of what you did. For example: </w:t>
-      </w:r>
-      <w:r>
-        <w:rPr>
-          <w:rFonts w:ascii="Courier New" w:cs="Courier New" w:eastAsia="Courier New" w:hAnsi="Courier New"/>
-          <w:sz w:val="18"/>
-          <w:szCs w:val="18"/>
-        </w:rPr>
-        <w:t xml:space="preserve">Add practice file for jsmith</w:t>
-      </w:r>
-      <w:r>
-        <w:rPr>
-          <w:rFonts w:ascii="Calibri" w:cs="Calibri" w:eastAsia="Calibri" w:hAnsi="Calibri"/>
-          <w:sz w:val="20"/>
-          <w:szCs w:val="20"/>
-        </w:rPr>
-        <w:t xml:space="preserve">.</w:t>
-      </w:r>
-    </w:p>
-    <w:p>
-      <w:pPr>
-        <w:pStyle w:val="ListParagraph"/>
-        <w:numPr>
-          <w:ilvl w:val="0"/>
-          <w:numId w:val="2"/>
-        </w:numPr>
-        <w:spacing w:after="40" w:before="40"/>
-      </w:pPr>
-      <w:r>
-        <w:rPr>
-          <w:rFonts w:ascii="Calibri" w:cs="Calibri" w:eastAsia="Calibri" w:hAnsi="Calibri"/>
-          <w:sz w:val="20"/>
-          <w:szCs w:val="20"/>
-        </w:rPr>
-        <w:t xml:space="preserve">Click the </w:t>
-      </w:r>
-      <w:r>
-        <w:rPr>
-          <w:rFonts w:ascii="Calibri" w:cs="Calibri" w:eastAsia="Calibri" w:hAnsi="Calibri"/>
-          <w:b/>
-          <w:bCs/>
-          <w:sz w:val="20"/>
-          <w:szCs w:val="20"/>
-        </w:rPr>
-        <w:t xml:space="preserve">Commit</w:t>
-      </w:r>
-      <w:r>
-        <w:rPr>
-          <w:rFonts w:ascii="Calibri" w:cs="Calibri" w:eastAsia="Calibri" w:hAnsi="Calibri"/>
-          <w:sz w:val="20"/>
-          <w:szCs w:val="20"/>
-        </w:rPr>
-        <w:t xml:space="preserve"> button (the checkmark above the message box).</w:t>
-      </w:r>
-    </w:p>
-    <w:p>
-      <w:pPr>
-        <w:spacing w:after="60" w:before="60"/>
-      </w:pPr>
-      <w:r>
-        <w:rPr>
-          <w:rFonts w:ascii="Calibri" w:cs="Calibri" w:eastAsia="Calibri" w:hAnsi="Calibri"/>
-          <w:sz w:val="20"/>
-          <w:szCs w:val="20"/>
-        </w:rPr>
-        <w:t xml:space="preserve">Your change is now saved locally.</w:t>
-      </w:r>
-    </w:p>
-    <w:p>
-      <w:pPr>
-        <w:pStyle w:val="Heading3"/>
-        <w:spacing w:after="60" w:before="200"/>
-      </w:pPr>
-      <w:r>
-        <w:rPr>
-          <w:rFonts w:ascii="Calibri" w:cs="Calibri" w:eastAsia="Calibri" w:hAnsi="Calibri"/>
-          <w:b/>
-          <w:bCs/>
-          <w:color w:val="2E75B6"/>
-          <w:sz w:val="22"/>
-          <w:szCs w:val="22"/>
-        </w:rPr>
-        <w:t xml:space="preserve">Step 5 - Push your changes to GitHub</w:t>
-      </w:r>
-    </w:p>
-    <w:p>
-      <w:pPr>
-        <w:spacing w:after="60" w:before="60"/>
-      </w:pPr>
-      <w:r>
-        <w:rPr>
-          <w:rFonts w:ascii="Calibri" w:cs="Calibri" w:eastAsia="Calibri" w:hAnsi="Calibri"/>
-          <w:sz w:val="20"/>
-          <w:szCs w:val="20"/>
-        </w:rPr>
-        <w:t xml:space="preserve">Pushing uploads your local commits to GitHub so the team can see them.</w:t>
-      </w:r>
-    </w:p>
-    <w:p>
-      <w:pPr>
-        <w:pStyle w:val="ListParagraph"/>
-        <w:numPr>
-          <w:ilvl w:val="0"/>
-          <w:numId w:val="2"/>
-        </w:numPr>
-        <w:spacing w:after="40" w:before="40"/>
-      </w:pPr>
-      <w:r>
-        <w:rPr>
-          <w:rFonts w:ascii="Calibri" w:cs="Calibri" w:eastAsia="Calibri" w:hAnsi="Calibri"/>
-          <w:sz w:val="20"/>
-          <w:szCs w:val="20"/>
-        </w:rPr>
-        <w:t xml:space="preserve">After committing, you will see a </w:t>
-      </w:r>
-      <w:r>
-        <w:rPr>
-          <w:rFonts w:ascii="Calibri" w:cs="Calibri" w:eastAsia="Calibri" w:hAnsi="Calibri"/>
-          <w:b/>
-          <w:bCs/>
-          <w:sz w:val="20"/>
-          <w:szCs w:val="20"/>
-        </w:rPr>
-        <w:t xml:space="preserve">Publish Branch</w:t>
-      </w:r>
-      <w:r>
-        <w:rPr>
-          <w:rFonts w:ascii="Calibri" w:cs="Calibri" w:eastAsia="Calibri" w:hAnsi="Calibri"/>
-          <w:sz w:val="20"/>
-          <w:szCs w:val="20"/>
-        </w:rPr>
-        <w:t xml:space="preserve"> or </w:t>
-      </w:r>
-      <w:r>
-        <w:rPr>
-          <w:rFonts w:ascii="Calibri" w:cs="Calibri" w:eastAsia="Calibri" w:hAnsi="Calibri"/>
-          <w:b/>
-          <w:bCs/>
-          <w:sz w:val="20"/>
-          <w:szCs w:val="20"/>
-        </w:rPr>
-        <w:t xml:space="preserve">Sync Changes</w:t>
-      </w:r>
-      <w:r>
-        <w:rPr>
-          <w:rFonts w:ascii="Calibri" w:cs="Calibri" w:eastAsia="Calibri" w:hAnsi="Calibri"/>
-          <w:sz w:val="20"/>
-          <w:szCs w:val="20"/>
-        </w:rPr>
-        <w:t xml:space="preserve"> button in the Source Control panel. Click it.</w:t>
-      </w:r>
-    </w:p>
-    <w:p>
-      <w:pPr>
-        <w:pStyle w:val="ListParagraph"/>
-        <w:numPr>
-          <w:ilvl w:val="0"/>
-          <w:numId w:val="2"/>
-        </w:numPr>
-        <w:spacing w:after="40" w:before="40"/>
-      </w:pPr>
-      <w:r>
-        <w:rPr>
-          <w:rFonts w:ascii="Calibri" w:cs="Calibri" w:eastAsia="Calibri" w:hAnsi="Calibri"/>
-          <w:sz w:val="20"/>
-          <w:szCs w:val="20"/>
-        </w:rPr>
-        <w:t xml:space="preserve">If asked whether to publish to GitHub, click </w:t>
-      </w:r>
-      <w:r>
-        <w:rPr>
-          <w:rFonts w:ascii="Calibri" w:cs="Calibri" w:eastAsia="Calibri" w:hAnsi="Calibri"/>
-          <w:b/>
-          <w:bCs/>
-          <w:sz w:val="20"/>
-          <w:szCs w:val="20"/>
-        </w:rPr>
-        <w:t xml:space="preserve">OK</w:t>
-      </w:r>
-      <w:r>
-        <w:rPr>
-          <w:rFonts w:ascii="Calibri" w:cs="Calibri" w:eastAsia="Calibri" w:hAnsi="Calibri"/>
-          <w:sz w:val="20"/>
-          <w:szCs w:val="20"/>
-        </w:rPr>
-        <w:t xml:space="preserve"> or </w:t>
-      </w:r>
-      <w:r>
-        <w:rPr>
-          <w:rFonts w:ascii="Calibri" w:cs="Calibri" w:eastAsia="Calibri" w:hAnsi="Calibri"/>
-          <w:b/>
-          <w:bCs/>
-          <w:sz w:val="20"/>
-          <w:szCs w:val="20"/>
-        </w:rPr>
-        <w:t xml:space="preserve">Publish Branch</w:t>
-      </w:r>
-      <w:r>
-        <w:rPr>
-          <w:rFonts w:ascii="Calibri" w:cs="Calibri" w:eastAsia="Calibri" w:hAnsi="Calibri"/>
-          <w:sz w:val="20"/>
-          <w:szCs w:val="20"/>
-        </w:rPr>
-        <w:t xml:space="preserve">.</w:t>
-      </w:r>
-    </w:p>
-    <w:p>
-      <w:pPr>
-        <w:pStyle w:val="Heading3"/>
-        <w:spacing w:after="60" w:before="200"/>
-      </w:pPr>
-      <w:r>
-        <w:rPr>
-          <w:rFonts w:ascii="Calibri" w:cs="Calibri" w:eastAsia="Calibri" w:hAnsi="Calibri"/>
-          <w:b/>
-          <w:bCs/>
-          <w:color w:val="2E75B6"/>
-          <w:sz w:val="22"/>
-          <w:szCs w:val="22"/>
-        </w:rPr>
-        <w:t xml:space="preserve">Step 6 - Verify on GitHub</w:t>
-      </w:r>
-    </w:p>
-    <w:p>
-      <w:pPr>
-        <w:pStyle w:val="ListParagraph"/>
-        <w:numPr>
-          <w:ilvl w:val="0"/>
-          <w:numId w:val="2"/>
-        </w:numPr>
-        <w:spacing w:after="40" w:before="40"/>
-      </w:pPr>
-      <w:r>
-        <w:rPr>
-          <w:rFonts w:ascii="Calibri" w:cs="Calibri" w:eastAsia="Calibri" w:hAnsi="Calibri"/>
-          <w:sz w:val="20"/>
-          <w:szCs w:val="20"/>
-        </w:rPr>
-        <w:t xml:space="preserve">Open your web browser and go to </w:t>
-      </w:r>
-      <w:r>
-        <w:rPr>
-          <w:rFonts w:ascii="Courier New" w:cs="Courier New" w:eastAsia="Courier New" w:hAnsi="Courier New"/>
-          <w:sz w:val="18"/>
-          <w:szCs w:val="18"/>
-        </w:rPr>
-        <w:t xml:space="preserve">https://github.com/skyline-ats/DevTeam-Sandbox</w:t>
-      </w:r>
-      <w:r>
-        <w:rPr>
-          <w:rFonts w:ascii="Calibri" w:cs="Calibri" w:eastAsia="Calibri" w:hAnsi="Calibri"/>
-          <w:sz w:val="20"/>
-          <w:szCs w:val="20"/>
-        </w:rPr>
-        <w:t xml:space="preserve">.</w:t>
-      </w:r>
-    </w:p>
-    <w:p>
-      <w:pPr>
-        <w:pStyle w:val="ListParagraph"/>
-        <w:numPr>
-          <w:ilvl w:val="0"/>
-          <w:numId w:val="2"/>
-        </w:numPr>
-        <w:spacing w:after="40" w:before="40"/>
-      </w:pPr>
-      <w:r>
-        <w:rPr>
-          <w:rFonts w:ascii="Calibri" w:cs="Calibri" w:eastAsia="Calibri" w:hAnsi="Calibri"/>
-          <w:sz w:val="20"/>
-          <w:szCs w:val="20"/>
-        </w:rPr>
-        <w:t xml:space="preserve">Click the </w:t>
-      </w:r>
-      <w:r>
-        <w:rPr>
-          <w:rFonts w:ascii="Calibri" w:cs="Calibri" w:eastAsia="Calibri" w:hAnsi="Calibri"/>
-          <w:b/>
-          <w:bCs/>
-          <w:sz w:val="20"/>
-          <w:szCs w:val="20"/>
-        </w:rPr>
-        <w:t xml:space="preserve">branch dropdown</w:t>
-      </w:r>
-      <w:r>
-        <w:rPr>
-          <w:rFonts w:ascii="Calibri" w:cs="Calibri" w:eastAsia="Calibri" w:hAnsi="Calibri"/>
-          <w:sz w:val="20"/>
-          <w:szCs w:val="20"/>
-        </w:rPr>
-        <w:t xml:space="preserve"> (it says </w:t>
-      </w:r>
-      <w:r>
-        <w:rPr>
-          <w:rFonts w:ascii="Courier New" w:cs="Courier New" w:eastAsia="Courier New" w:hAnsi="Courier New"/>
-          <w:sz w:val="18"/>
-          <w:szCs w:val="18"/>
-        </w:rPr>
-        <w:t xml:space="preserve">main</w:t>
-      </w:r>
-      <w:r>
-        <w:rPr>
-          <w:rFonts w:ascii="Calibri" w:cs="Calibri" w:eastAsia="Calibri" w:hAnsi="Calibri"/>
-          <w:sz w:val="20"/>
-          <w:szCs w:val="20"/>
-        </w:rPr>
-        <w:t xml:space="preserve"> by default) and look for your branch name.</w:t>
-      </w:r>
-    </w:p>
-    <w:p>
-      <w:pPr>
-        <w:pStyle w:val="ListParagraph"/>
-        <w:numPr>
-          <w:ilvl w:val="0"/>
-          <w:numId w:val="2"/>
-        </w:numPr>
-        <w:spacing w:after="40" w:before="40"/>
-      </w:pPr>
-      <w:r>
-        <w:rPr>
-          <w:rFonts w:ascii="Calibri" w:cs="Calibri" w:eastAsia="Calibri" w:hAnsi="Calibri"/>
-          <w:sz w:val="20"/>
-          <w:szCs w:val="20"/>
-        </w:rPr>
-        <w:t xml:space="preserve">Select your branch - you should see your practice file there.</w:t>
-      </w:r>
-    </w:p>
-    <w:p>
-      <w:pPr>
-        <w:spacing w:after="60" w:before="60"/>
-      </w:pPr>
-      <w:r>
-        <w:rPr>
-          <w:rFonts w:ascii="Calibri" w:cs="Calibri" w:eastAsia="Calibri" w:hAnsi="Calibri"/>
-          <w:b/>
-          <w:bCs/>
-          <w:sz w:val="20"/>
-          <w:szCs w:val="20"/>
-        </w:rPr>
-        <w:t xml:space="preserve">Congratulations - you have completed the full Git workflow: create branch, edit, commit, push.</w:t>
+          <w:b/>
+          <w:bCs/>
+          <w:sz w:val="20"/>
+          <w:szCs w:val="20"/>
+        </w:rPr>
+        <w:t xml:space="preserve">Congratulations - you have completed the full Git workflow: pull, create branch, edit, commit, push.</w:t>
       </w:r>
     </w:p>
     <w:p>
@@ -5364,166 +5451,7 @@
           <w:sz w:val="28"/>
           <w:szCs w:val="28"/>
         </w:rPr>
-        <w:t xml:space="preserve">Part 8 - Pulling updates from GitHub</w:t>
-      </w:r>
-    </w:p>
-    <w:p>
-      <w:pPr>
-        <w:spacing w:after="60" w:before="60"/>
-      </w:pPr>
-      <w:r>
-        <w:rPr>
-          <w:rFonts w:ascii="Calibri" w:cs="Calibri" w:eastAsia="Calibri" w:hAnsi="Calibri"/>
-          <w:sz w:val="20"/>
-          <w:szCs w:val="20"/>
-        </w:rPr>
-        <w:t xml:space="preserve">Before starting work each day, always pull the latest changes from GitHub so your local copy is up to date.</w:t>
-      </w:r>
-    </w:p>
-    <w:p>
-      <w:pPr>
-        <w:pStyle w:val="ListParagraph"/>
-        <w:numPr>
-          <w:ilvl w:val="0"/>
-          <w:numId w:val="2"/>
-        </w:numPr>
-        <w:spacing w:after="40" w:before="40"/>
-      </w:pPr>
-      <w:r>
-        <w:rPr>
-          <w:rFonts w:ascii="Calibri" w:cs="Calibri" w:eastAsia="Calibri" w:hAnsi="Calibri"/>
-          <w:sz w:val="20"/>
-          <w:szCs w:val="20"/>
-        </w:rPr>
-        <w:t xml:space="preserve">In VSCode, click the </w:t>
-      </w:r>
-      <w:r>
-        <w:rPr>
-          <w:rFonts w:ascii="Calibri" w:cs="Calibri" w:eastAsia="Calibri" w:hAnsi="Calibri"/>
-          <w:b/>
-          <w:bCs/>
-          <w:sz w:val="20"/>
-          <w:szCs w:val="20"/>
-        </w:rPr>
-        <w:t xml:space="preserve">Source Control</w:t>
-      </w:r>
-      <w:r>
-        <w:rPr>
-          <w:rFonts w:ascii="Calibri" w:cs="Calibri" w:eastAsia="Calibri" w:hAnsi="Calibri"/>
-          <w:sz w:val="20"/>
-          <w:szCs w:val="20"/>
-        </w:rPr>
-        <w:t xml:space="preserve"> icon.</w:t>
-      </w:r>
-    </w:p>
-    <w:p>
-      <w:pPr>
-        <w:pStyle w:val="ListParagraph"/>
-        <w:numPr>
-          <w:ilvl w:val="0"/>
-          <w:numId w:val="2"/>
-        </w:numPr>
-        <w:spacing w:after="40" w:before="40"/>
-      </w:pPr>
-      <w:r>
-        <w:rPr>
-          <w:rFonts w:ascii="Calibri" w:cs="Calibri" w:eastAsia="Calibri" w:hAnsi="Calibri"/>
-          <w:sz w:val="20"/>
-          <w:szCs w:val="20"/>
-        </w:rPr>
-        <w:t xml:space="preserve">Click the </w:t>
-      </w:r>
-      <w:r>
-        <w:rPr>
-          <w:rFonts w:ascii="Calibri" w:cs="Calibri" w:eastAsia="Calibri" w:hAnsi="Calibri"/>
-          <w:b/>
-          <w:bCs/>
-          <w:sz w:val="20"/>
-          <w:szCs w:val="20"/>
-        </w:rPr>
-        <w:t xml:space="preserve">...</w:t>
-      </w:r>
-      <w:r>
-        <w:rPr>
-          <w:rFonts w:ascii="Calibri" w:cs="Calibri" w:eastAsia="Calibri" w:hAnsi="Calibri"/>
-          <w:sz w:val="20"/>
-          <w:szCs w:val="20"/>
-        </w:rPr>
-        <w:t xml:space="preserve"> (three dots) menu at the top of the Source Control panel.</w:t>
-      </w:r>
-    </w:p>
-    <w:p>
-      <w:pPr>
-        <w:pStyle w:val="ListParagraph"/>
-        <w:numPr>
-          <w:ilvl w:val="0"/>
-          <w:numId w:val="2"/>
-        </w:numPr>
-        <w:spacing w:after="40" w:before="40"/>
-      </w:pPr>
-      <w:r>
-        <w:rPr>
-          <w:rFonts w:ascii="Calibri" w:cs="Calibri" w:eastAsia="Calibri" w:hAnsi="Calibri"/>
-          <w:sz w:val="20"/>
-          <w:szCs w:val="20"/>
-        </w:rPr>
-        <w:t xml:space="preserve">Select </w:t>
-      </w:r>
-      <w:r>
-        <w:rPr>
-          <w:rFonts w:ascii="Calibri" w:cs="Calibri" w:eastAsia="Calibri" w:hAnsi="Calibri"/>
-          <w:b/>
-          <w:bCs/>
-          <w:sz w:val="20"/>
-          <w:szCs w:val="20"/>
-        </w:rPr>
-        <w:t xml:space="preserve">Pull</w:t>
-      </w:r>
-      <w:r>
-        <w:rPr>
-          <w:rFonts w:ascii="Calibri" w:cs="Calibri" w:eastAsia="Calibri" w:hAnsi="Calibri"/>
-          <w:sz w:val="20"/>
-          <w:szCs w:val="20"/>
-        </w:rPr>
-        <w:t xml:space="preserve">.</w:t>
-      </w:r>
-    </w:p>
-    <w:p>
-      <w:pPr>
-        <w:spacing w:after="60" w:before="60"/>
-      </w:pPr>
-      <w:r>
-        <w:rPr>
-          <w:rFonts w:ascii="Calibri" w:cs="Calibri" w:eastAsia="Calibri" w:hAnsi="Calibri"/>
-          <w:sz w:val="20"/>
-          <w:szCs w:val="20"/>
-        </w:rPr>
-        <w:t xml:space="preserve">VSCode will download any changes made by others.</w:t>
-      </w:r>
-    </w:p>
-    <w:p>
-      <w:pPr>
-        <w:spacing w:after="100" w:before="0"/>
-      </w:pPr>
-    </w:p>
-    <w:p>
-      <w:pPr>
-        <w:pStyle w:val="Heading2"/>
-        <w:pBdr>
-          <w:bottom w:val="single" w:color="0070C0" w:sz="4"/>
-        </w:pBdr>
-        <w:spacing w:after="80" w:before="320"/>
-      </w:pPr>
-      <w:r>
-        <w:rPr>
-          <w:rFonts w:ascii="Calibri" w:cs="Calibri" w:eastAsia="Calibri" w:hAnsi="Calibri"/>
-          <w:b/>
-          <w:bCs/>
-          <w:color w:val="1F3864"/>
-          <w:sz w:val="28"/>
-          <w:szCs w:val="28"/>
-        </w:rPr>
-        <w:t xml:space="preserve">Part 9 - Using the Cisco U Preview</w:t>
+        <w:t xml:space="preserve">Part 8 - Using the Cisco U Preview</w:t>
       </w:r>
     </w:p>
     <w:p>
@@ -5796,7 +5724,7 @@
                 <w:sz w:val="20"/>
                 <w:szCs w:val="20"/>
               </w:rPr>
-              <w:t xml:space="preserve">Pull latest changes (Source Control &gt; ... &gt; Pull)</w:t>
+              <w:t xml:space="preserve">Pull latest (Source Control, three dots menu, Pull)</w:t>
             </w:r>
           </w:p>
         </w:tc>
@@ -5844,7 +5772,7 @@
                 <w:sz w:val="20"/>
                 <w:szCs w:val="20"/>
               </w:rPr>
-              <w:t xml:space="preserve">Click branch name bottom-left &gt; + Create new branch</w:t>
+              <w:t xml:space="preserve">Click branch name bottom-left, then + Create new branch</w:t>
             </w:r>
           </w:p>
         </w:tc>
@@ -5892,7 +5820,7 @@
                 <w:sz w:val="20"/>
                 <w:szCs w:val="20"/>
               </w:rPr>
-              <w:t xml:space="preserve">Stage files (+) &gt; add a message &gt; click Commit</w:t>
+              <w:t xml:space="preserve">Stage files (+), add a message, click Commit</w:t>
             </w:r>
           </w:p>
         </w:tc>
@@ -5940,7 +5868,7 @@
                 <w:sz w:val="20"/>
                 <w:szCs w:val="20"/>
               </w:rPr>
-              <w:t xml:space="preserve">Click Publish Branch / Sync Changes in Source Control</w:t>
+              <w:t xml:space="preserve">Click Publish Branch or Sync Changes in Source Control</w:t>
             </w:r>
           </w:p>
         </w:tc>
@@ -6013,7 +5941,7 @@
                 <w:sz w:val="20"/>
                 <w:szCs w:val="20"/>
               </w:rPr>
-              <w:t xml:space="preserve">Preview your Markdown in Cisco U style</w:t>
+              <w:t xml:space="preserve">Preview content in Cisco U style</w:t>
             </w:r>
           </w:p>
         </w:tc>
@@ -6036,7 +5964,7 @@
                 <w:sz w:val="20"/>
                 <w:szCs w:val="20"/>
               </w:rPr>
-              <w:t xml:space="preserve">Ctrl+Shift+P &gt; Cisco U: Preview</w:t>
+              <w:t xml:space="preserve">Ctrl+Shift+P, then Cisco U: Preview</w:t>
             </w:r>
           </w:p>
         </w:tc>
@@ -6154,7 +6082,7 @@
           <w:sz w:val="20"/>
           <w:szCs w:val="20"/>
         </w:rPr>
-        <w:t xml:space="preserve"> branch with care.</w:t>
+        <w:t xml:space="preserve"> branch with care and always work in your own branch.</w:t>
       </w:r>
     </w:p>
     <w:sectPr>

</xml_diff>